<commit_message>
sou gay e tu? adoro lando norris ln4ever
</commit_message>
<xml_diff>
--- a/docs/Relatório.docx
+++ b/docs/Relatório.docx
@@ -329,7 +329,15 @@
           <w:spacing w:val="-4"/>
           <w:sz w:val="28"/>
         </w:rPr>
-        <w:t>202</w:t>
+        <w:t>2025/2026</w:t>
+      </w:r>
+      <w:r>
+        <w:rPr>
+          <w:rFonts w:ascii="Times New Roman" w:hAnsi="Times New Roman" w:cs="Times New Roman"/>
+          <w:spacing w:val="-14"/>
+          <w:sz w:val="28"/>
+        </w:rPr>
+        <w:t xml:space="preserve"> </w:t>
       </w:r>
       <w:r>
         <w:rPr>
@@ -337,7 +345,15 @@
           <w:spacing w:val="-4"/>
           <w:sz w:val="28"/>
         </w:rPr>
-        <w:t>5</w:t>
+        <w:t>da</w:t>
+      </w:r>
+      <w:r>
+        <w:rPr>
+          <w:rFonts w:ascii="Times New Roman" w:hAnsi="Times New Roman" w:cs="Times New Roman"/>
+          <w:spacing w:val="-14"/>
+          <w:sz w:val="28"/>
+        </w:rPr>
+        <w:t xml:space="preserve"> </w:t>
       </w:r>
       <w:r>
         <w:rPr>
@@ -345,7 +361,15 @@
           <w:spacing w:val="-4"/>
           <w:sz w:val="28"/>
         </w:rPr>
-        <w:t>/202</w:t>
+        <w:t>disciplina</w:t>
+      </w:r>
+      <w:r>
+        <w:rPr>
+          <w:rFonts w:ascii="Times New Roman" w:hAnsi="Times New Roman" w:cs="Times New Roman"/>
+          <w:spacing w:val="-14"/>
+          <w:sz w:val="28"/>
+        </w:rPr>
+        <w:t xml:space="preserve"> </w:t>
       </w:r>
       <w:r>
         <w:rPr>
@@ -353,54 +377,6 @@
           <w:spacing w:val="-4"/>
           <w:sz w:val="28"/>
         </w:rPr>
-        <w:t>6</w:t>
-      </w:r>
-      <w:r>
-        <w:rPr>
-          <w:rFonts w:ascii="Times New Roman" w:hAnsi="Times New Roman" w:cs="Times New Roman"/>
-          <w:spacing w:val="-14"/>
-          <w:sz w:val="28"/>
-        </w:rPr>
-        <w:t xml:space="preserve"> </w:t>
-      </w:r>
-      <w:r>
-        <w:rPr>
-          <w:rFonts w:ascii="Times New Roman" w:hAnsi="Times New Roman" w:cs="Times New Roman"/>
-          <w:spacing w:val="-4"/>
-          <w:sz w:val="28"/>
-        </w:rPr>
-        <w:t>da</w:t>
-      </w:r>
-      <w:r>
-        <w:rPr>
-          <w:rFonts w:ascii="Times New Roman" w:hAnsi="Times New Roman" w:cs="Times New Roman"/>
-          <w:spacing w:val="-14"/>
-          <w:sz w:val="28"/>
-        </w:rPr>
-        <w:t xml:space="preserve"> </w:t>
-      </w:r>
-      <w:r>
-        <w:rPr>
-          <w:rFonts w:ascii="Times New Roman" w:hAnsi="Times New Roman" w:cs="Times New Roman"/>
-          <w:spacing w:val="-4"/>
-          <w:sz w:val="28"/>
-        </w:rPr>
-        <w:t>disciplina</w:t>
-      </w:r>
-      <w:r>
-        <w:rPr>
-          <w:rFonts w:ascii="Times New Roman" w:hAnsi="Times New Roman" w:cs="Times New Roman"/>
-          <w:spacing w:val="-14"/>
-          <w:sz w:val="28"/>
-        </w:rPr>
-        <w:t xml:space="preserve"> </w:t>
-      </w:r>
-      <w:r>
-        <w:rPr>
-          <w:rFonts w:ascii="Times New Roman" w:hAnsi="Times New Roman" w:cs="Times New Roman"/>
-          <w:spacing w:val="-4"/>
-          <w:sz w:val="28"/>
-        </w:rPr>
         <w:t xml:space="preserve">de </w:t>
       </w:r>
       <w:r>
@@ -408,14 +384,7 @@
           <w:rFonts w:ascii="Times New Roman" w:hAnsi="Times New Roman" w:cs="Times New Roman"/>
           <w:sz w:val="28"/>
         </w:rPr>
-        <w:t>Sistemas Distribuídos</w:t>
-      </w:r>
-      <w:r>
-        <w:rPr>
-          <w:rFonts w:ascii="Times New Roman" w:hAnsi="Times New Roman" w:cs="Times New Roman"/>
-          <w:sz w:val="28"/>
-        </w:rPr>
-        <w:t xml:space="preserve"> da</w:t>
+        <w:t>Sistemas Distribuídos da</w:t>
       </w:r>
       <w:r>
         <w:rPr>
@@ -752,17 +721,33 @@
         <w:jc w:val="center"/>
         <w:rPr>
           <w:rFonts w:ascii="Times New Roman" w:hAnsi="Times New Roman" w:cs="Times New Roman"/>
-          <w:sz w:val="36"/>
-          <w:szCs w:val="36"/>
-        </w:rPr>
-      </w:pPr>
-      <w:r>
-        <w:rPr>
-          <w:rFonts w:ascii="Times New Roman" w:hAnsi="Times New Roman" w:cs="Times New Roman"/>
-          <w:sz w:val="36"/>
-          <w:szCs w:val="36"/>
-        </w:rPr>
-        <w:t>José Amado e José Silva</w:t>
+          <w:sz w:val="28"/>
+          <w:szCs w:val="28"/>
+        </w:rPr>
+      </w:pPr>
+      <w:r>
+        <w:rPr>
+          <w:rFonts w:ascii="Times New Roman" w:hAnsi="Times New Roman" w:cs="Times New Roman"/>
+          <w:sz w:val="28"/>
+          <w:szCs w:val="28"/>
+        </w:rPr>
+        <w:t>José Amado</w:t>
+      </w:r>
+      <w:r>
+        <w:rPr>
+          <w:rFonts w:ascii="Times New Roman" w:hAnsi="Times New Roman" w:cs="Times New Roman"/>
+          <w:sz w:val="28"/>
+          <w:szCs w:val="28"/>
+        </w:rPr>
+        <w:t>,</w:t>
+      </w:r>
+      <w:r>
+        <w:rPr>
+          <w:rFonts w:ascii="Times New Roman" w:hAnsi="Times New Roman" w:cs="Times New Roman"/>
+          <w:sz w:val="28"/>
+          <w:szCs w:val="28"/>
+        </w:rPr>
+        <w:t xml:space="preserve"> José Silva</w:t>
       </w:r>
     </w:p>
     <w:p>
@@ -770,15 +755,15 @@
         <w:jc w:val="center"/>
         <w:rPr>
           <w:rFonts w:ascii="Times New Roman" w:hAnsi="Times New Roman" w:cs="Times New Roman"/>
-          <w:sz w:val="36"/>
-          <w:szCs w:val="36"/>
-        </w:rPr>
-      </w:pPr>
-      <w:r>
-        <w:rPr>
-          <w:rFonts w:ascii="Times New Roman" w:hAnsi="Times New Roman" w:cs="Times New Roman"/>
-          <w:sz w:val="36"/>
-          <w:szCs w:val="36"/>
+          <w:sz w:val="28"/>
+          <w:szCs w:val="28"/>
+        </w:rPr>
+      </w:pPr>
+      <w:r>
+        <w:rPr>
+          <w:rFonts w:ascii="Times New Roman" w:hAnsi="Times New Roman" w:cs="Times New Roman"/>
+          <w:sz w:val="28"/>
+          <w:szCs w:val="28"/>
         </w:rPr>
         <w:t>Coimbra, 2025</w:t>
       </w:r>
@@ -800,8 +785,8 @@
         <w:jc w:val="both"/>
         <w:rPr>
           <w:rFonts w:ascii="Times New Roman" w:hAnsi="Times New Roman" w:cs="Times New Roman"/>
-          <w:sz w:val="40"/>
-          <w:szCs w:val="40"/>
+          <w:sz w:val="32"/>
+          <w:szCs w:val="32"/>
         </w:rPr>
       </w:pPr>
       <w:r>
@@ -809,8 +794,8 @@
           <w:rFonts w:ascii="Times New Roman" w:hAnsi="Times New Roman" w:cs="Times New Roman"/>
           <w:b/>
           <w:bCs/>
-          <w:sz w:val="56"/>
-          <w:szCs w:val="56"/>
+          <w:sz w:val="48"/>
+          <w:szCs w:val="48"/>
         </w:rPr>
         <w:t>Índice</w:t>
       </w:r>
@@ -825,15 +810,15 @@
         <w:jc w:val="both"/>
         <w:rPr>
           <w:rFonts w:ascii="Times New Roman" w:hAnsi="Times New Roman" w:cs="Times New Roman"/>
-          <w:sz w:val="36"/>
-          <w:szCs w:val="36"/>
-        </w:rPr>
-      </w:pPr>
-      <w:r>
-        <w:rPr>
-          <w:rFonts w:ascii="Times New Roman" w:hAnsi="Times New Roman" w:cs="Times New Roman"/>
-          <w:sz w:val="36"/>
-          <w:szCs w:val="36"/>
+          <w:sz w:val="32"/>
+          <w:szCs w:val="32"/>
+        </w:rPr>
+      </w:pPr>
+      <w:r>
+        <w:rPr>
+          <w:rFonts w:ascii="Times New Roman" w:hAnsi="Times New Roman" w:cs="Times New Roman"/>
+          <w:sz w:val="32"/>
+          <w:szCs w:val="32"/>
         </w:rPr>
         <w:t>Introdução</w:t>
       </w:r>
@@ -848,47 +833,47 @@
         <w:jc w:val="both"/>
         <w:rPr>
           <w:rFonts w:ascii="Times New Roman" w:hAnsi="Times New Roman" w:cs="Times New Roman"/>
-          <w:sz w:val="36"/>
-          <w:szCs w:val="36"/>
-        </w:rPr>
-      </w:pPr>
-      <w:r>
-        <w:rPr>
-          <w:rFonts w:ascii="Times New Roman" w:hAnsi="Times New Roman" w:cs="Times New Roman"/>
-          <w:sz w:val="36"/>
-          <w:szCs w:val="36"/>
+          <w:sz w:val="32"/>
+          <w:szCs w:val="32"/>
+        </w:rPr>
+      </w:pPr>
+      <w:r>
+        <w:rPr>
+          <w:rFonts w:ascii="Times New Roman" w:hAnsi="Times New Roman" w:cs="Times New Roman"/>
+          <w:sz w:val="32"/>
+          <w:szCs w:val="32"/>
         </w:rPr>
         <w:t>Arquitetura</w:t>
       </w:r>
       <w:r>
         <w:rPr>
           <w:rFonts w:ascii="Times New Roman" w:hAnsi="Times New Roman" w:cs="Times New Roman"/>
-          <w:sz w:val="36"/>
-          <w:szCs w:val="36"/>
+          <w:sz w:val="32"/>
+          <w:szCs w:val="32"/>
         </w:rPr>
         <w:t xml:space="preserve"> geral</w:t>
       </w:r>
       <w:r>
         <w:rPr>
           <w:rFonts w:ascii="Times New Roman" w:hAnsi="Times New Roman" w:cs="Times New Roman"/>
-          <w:sz w:val="36"/>
-          <w:szCs w:val="36"/>
+          <w:sz w:val="32"/>
+          <w:szCs w:val="32"/>
         </w:rPr>
         <w:t xml:space="preserve"> do </w:t>
       </w:r>
       <w:r>
         <w:rPr>
           <w:rFonts w:ascii="Times New Roman" w:hAnsi="Times New Roman" w:cs="Times New Roman"/>
-          <w:sz w:val="36"/>
-          <w:szCs w:val="36"/>
+          <w:sz w:val="32"/>
+          <w:szCs w:val="32"/>
         </w:rPr>
         <w:t>p</w:t>
       </w:r>
       <w:r>
         <w:rPr>
           <w:rFonts w:ascii="Times New Roman" w:hAnsi="Times New Roman" w:cs="Times New Roman"/>
-          <w:sz w:val="36"/>
-          <w:szCs w:val="36"/>
+          <w:sz w:val="32"/>
+          <w:szCs w:val="32"/>
         </w:rPr>
         <w:t>rojeto</w:t>
       </w:r>
@@ -903,15 +888,15 @@
         <w:jc w:val="both"/>
         <w:rPr>
           <w:rFonts w:ascii="Times New Roman" w:hAnsi="Times New Roman" w:cs="Times New Roman"/>
-          <w:sz w:val="36"/>
-          <w:szCs w:val="36"/>
-        </w:rPr>
-      </w:pPr>
-      <w:r>
-        <w:rPr>
-          <w:rFonts w:ascii="Times New Roman" w:hAnsi="Times New Roman" w:cs="Times New Roman"/>
-          <w:sz w:val="36"/>
-          <w:szCs w:val="36"/>
+          <w:sz w:val="32"/>
+          <w:szCs w:val="32"/>
+        </w:rPr>
+      </w:pPr>
+      <w:r>
+        <w:rPr>
+          <w:rFonts w:ascii="Times New Roman" w:hAnsi="Times New Roman" w:cs="Times New Roman"/>
+          <w:sz w:val="32"/>
+          <w:szCs w:val="32"/>
         </w:rPr>
         <w:t>Componente de Replicação do Índice</w:t>
       </w:r>
@@ -926,31 +911,31 @@
         <w:jc w:val="both"/>
         <w:rPr>
           <w:rFonts w:ascii="Times New Roman" w:hAnsi="Times New Roman" w:cs="Times New Roman"/>
-          <w:sz w:val="44"/>
-          <w:szCs w:val="44"/>
-        </w:rPr>
-      </w:pPr>
-      <w:r>
-        <w:rPr>
-          <w:rFonts w:ascii="Times New Roman" w:hAnsi="Times New Roman" w:cs="Times New Roman"/>
-          <w:sz w:val="36"/>
-          <w:szCs w:val="36"/>
+          <w:sz w:val="40"/>
+          <w:szCs w:val="40"/>
+        </w:rPr>
+      </w:pPr>
+      <w:r>
+        <w:rPr>
+          <w:rFonts w:ascii="Times New Roman" w:hAnsi="Times New Roman" w:cs="Times New Roman"/>
+          <w:sz w:val="32"/>
+          <w:szCs w:val="32"/>
         </w:rPr>
         <w:t>Componente</w:t>
       </w:r>
       <w:r>
         <w:rPr>
           <w:rFonts w:ascii="Times New Roman" w:hAnsi="Times New Roman" w:cs="Times New Roman"/>
-          <w:sz w:val="36"/>
-          <w:szCs w:val="36"/>
+          <w:sz w:val="32"/>
+          <w:szCs w:val="32"/>
         </w:rPr>
         <w:t xml:space="preserve"> RMI</w:t>
       </w:r>
       <w:r>
         <w:rPr>
           <w:rFonts w:ascii="Times New Roman" w:hAnsi="Times New Roman" w:cs="Times New Roman"/>
-          <w:sz w:val="36"/>
-          <w:szCs w:val="36"/>
+          <w:sz w:val="32"/>
+          <w:szCs w:val="32"/>
         </w:rPr>
         <w:t xml:space="preserve"> </w:t>
       </w:r>
@@ -965,15 +950,15 @@
         <w:jc w:val="both"/>
         <w:rPr>
           <w:rFonts w:ascii="Times New Roman" w:hAnsi="Times New Roman" w:cs="Times New Roman"/>
-          <w:sz w:val="44"/>
-          <w:szCs w:val="44"/>
-        </w:rPr>
-      </w:pPr>
-      <w:r>
-        <w:rPr>
-          <w:rFonts w:ascii="Times New Roman" w:hAnsi="Times New Roman" w:cs="Times New Roman"/>
-          <w:sz w:val="36"/>
-          <w:szCs w:val="36"/>
+          <w:sz w:val="40"/>
+          <w:szCs w:val="40"/>
+        </w:rPr>
+      </w:pPr>
+      <w:r>
+        <w:rPr>
+          <w:rFonts w:ascii="Times New Roman" w:hAnsi="Times New Roman" w:cs="Times New Roman"/>
+          <w:sz w:val="32"/>
+          <w:szCs w:val="32"/>
         </w:rPr>
         <w:t>Testes realizados</w:t>
       </w:r>
@@ -988,38 +973,38 @@
         <w:jc w:val="both"/>
         <w:rPr>
           <w:rFonts w:ascii="Times New Roman" w:hAnsi="Times New Roman" w:cs="Times New Roman"/>
+          <w:sz w:val="40"/>
+          <w:szCs w:val="40"/>
+        </w:rPr>
+      </w:pPr>
+      <w:r>
+        <w:rPr>
+          <w:rFonts w:ascii="Times New Roman" w:hAnsi="Times New Roman" w:cs="Times New Roman"/>
+          <w:sz w:val="32"/>
+          <w:szCs w:val="32"/>
+        </w:rPr>
+        <w:t>Distribuição de tarefas</w:t>
+      </w:r>
+    </w:p>
+    <w:p>
+      <w:pPr>
+        <w:jc w:val="both"/>
+        <w:rPr>
+          <w:rFonts w:ascii="Times New Roman" w:hAnsi="Times New Roman" w:cs="Times New Roman"/>
           <w:sz w:val="44"/>
           <w:szCs w:val="44"/>
         </w:rPr>
       </w:pPr>
-      <w:r>
-        <w:rPr>
-          <w:rFonts w:ascii="Times New Roman" w:hAnsi="Times New Roman" w:cs="Times New Roman"/>
-          <w:sz w:val="36"/>
-          <w:szCs w:val="36"/>
-        </w:rPr>
-        <w:t>Distribuição de tarefas</w:t>
-      </w:r>
     </w:p>
     <w:p>
       <w:pPr>
         <w:jc w:val="both"/>
         <w:rPr>
           <w:rFonts w:ascii="Times New Roman" w:hAnsi="Times New Roman" w:cs="Times New Roman"/>
-          <w:sz w:val="44"/>
-          <w:szCs w:val="44"/>
-        </w:rPr>
-      </w:pPr>
-    </w:p>
-    <w:p>
-      <w:pPr>
-        <w:jc w:val="both"/>
-        <w:rPr>
-          <w:rFonts w:ascii="Times New Roman" w:hAnsi="Times New Roman" w:cs="Times New Roman"/>
           <w:b/>
           <w:bCs/>
-          <w:sz w:val="56"/>
-          <w:szCs w:val="56"/>
+          <w:sz w:val="48"/>
+          <w:szCs w:val="48"/>
         </w:rPr>
       </w:pPr>
       <w:r>
@@ -1027,8 +1012,8 @@
           <w:rFonts w:ascii="Times New Roman" w:hAnsi="Times New Roman" w:cs="Times New Roman"/>
           <w:b/>
           <w:bCs/>
-          <w:sz w:val="56"/>
-          <w:szCs w:val="56"/>
+          <w:sz w:val="48"/>
+          <w:szCs w:val="48"/>
         </w:rPr>
         <w:t>Introdução</w:t>
       </w:r>

</xml_diff>

<commit_message>
Add initial database schema for URL and Words tables in diagram.json
- Created tables for URL and Words with respective fields and attributes.
- Established relationships between tables, including references and cardinality.
- Included a Stop Words table for managing common stop words.
</commit_message>
<xml_diff>
--- a/docs/Relatório.docx
+++ b/docs/Relatório.docx
@@ -810,17 +810,25 @@
         <w:jc w:val="both"/>
         <w:rPr>
           <w:rFonts w:ascii="Times New Roman" w:hAnsi="Times New Roman" w:cs="Times New Roman"/>
-          <w:sz w:val="32"/>
-          <w:szCs w:val="32"/>
-        </w:rPr>
-      </w:pPr>
-      <w:r>
-        <w:rPr>
-          <w:rFonts w:ascii="Times New Roman" w:hAnsi="Times New Roman" w:cs="Times New Roman"/>
-          <w:sz w:val="32"/>
-          <w:szCs w:val="32"/>
+          <w:sz w:val="28"/>
+          <w:szCs w:val="28"/>
+        </w:rPr>
+      </w:pPr>
+      <w:r>
+        <w:rPr>
+          <w:rFonts w:ascii="Times New Roman" w:hAnsi="Times New Roman" w:cs="Times New Roman"/>
+          <w:sz w:val="28"/>
+          <w:szCs w:val="28"/>
         </w:rPr>
         <w:t>Introdução</w:t>
+      </w:r>
+      <w:r>
+        <w:rPr>
+          <w:rFonts w:ascii="Times New Roman" w:hAnsi="Times New Roman" w:cs="Times New Roman"/>
+          <w:sz w:val="28"/>
+          <w:szCs w:val="28"/>
+        </w:rPr>
+        <w:t>.</w:t>
       </w:r>
     </w:p>
     <w:p>
@@ -833,49 +841,57 @@
         <w:jc w:val="both"/>
         <w:rPr>
           <w:rFonts w:ascii="Times New Roman" w:hAnsi="Times New Roman" w:cs="Times New Roman"/>
-          <w:sz w:val="32"/>
-          <w:szCs w:val="32"/>
-        </w:rPr>
-      </w:pPr>
-      <w:r>
-        <w:rPr>
-          <w:rFonts w:ascii="Times New Roman" w:hAnsi="Times New Roman" w:cs="Times New Roman"/>
-          <w:sz w:val="32"/>
-          <w:szCs w:val="32"/>
+          <w:sz w:val="28"/>
+          <w:szCs w:val="28"/>
+        </w:rPr>
+      </w:pPr>
+      <w:r>
+        <w:rPr>
+          <w:rFonts w:ascii="Times New Roman" w:hAnsi="Times New Roman" w:cs="Times New Roman"/>
+          <w:sz w:val="28"/>
+          <w:szCs w:val="28"/>
         </w:rPr>
         <w:t>Arquitetura</w:t>
       </w:r>
       <w:r>
         <w:rPr>
           <w:rFonts w:ascii="Times New Roman" w:hAnsi="Times New Roman" w:cs="Times New Roman"/>
-          <w:sz w:val="32"/>
-          <w:szCs w:val="32"/>
+          <w:sz w:val="28"/>
+          <w:szCs w:val="28"/>
         </w:rPr>
         <w:t xml:space="preserve"> geral</w:t>
       </w:r>
       <w:r>
         <w:rPr>
           <w:rFonts w:ascii="Times New Roman" w:hAnsi="Times New Roman" w:cs="Times New Roman"/>
-          <w:sz w:val="32"/>
-          <w:szCs w:val="32"/>
+          <w:sz w:val="28"/>
+          <w:szCs w:val="28"/>
         </w:rPr>
         <w:t xml:space="preserve"> do </w:t>
       </w:r>
       <w:r>
         <w:rPr>
           <w:rFonts w:ascii="Times New Roman" w:hAnsi="Times New Roman" w:cs="Times New Roman"/>
-          <w:sz w:val="32"/>
-          <w:szCs w:val="32"/>
+          <w:sz w:val="28"/>
+          <w:szCs w:val="28"/>
         </w:rPr>
         <w:t>p</w:t>
       </w:r>
       <w:r>
         <w:rPr>
           <w:rFonts w:ascii="Times New Roman" w:hAnsi="Times New Roman" w:cs="Times New Roman"/>
-          <w:sz w:val="32"/>
-          <w:szCs w:val="32"/>
+          <w:sz w:val="28"/>
+          <w:szCs w:val="28"/>
         </w:rPr>
         <w:t>rojeto</w:t>
+      </w:r>
+      <w:r>
+        <w:rPr>
+          <w:rFonts w:ascii="Times New Roman" w:hAnsi="Times New Roman" w:cs="Times New Roman"/>
+          <w:sz w:val="28"/>
+          <w:szCs w:val="28"/>
+        </w:rPr>
+        <w:t>.</w:t>
       </w:r>
     </w:p>
     <w:p>
@@ -888,17 +904,25 @@
         <w:jc w:val="both"/>
         <w:rPr>
           <w:rFonts w:ascii="Times New Roman" w:hAnsi="Times New Roman" w:cs="Times New Roman"/>
-          <w:sz w:val="32"/>
-          <w:szCs w:val="32"/>
-        </w:rPr>
-      </w:pPr>
-      <w:r>
-        <w:rPr>
-          <w:rFonts w:ascii="Times New Roman" w:hAnsi="Times New Roman" w:cs="Times New Roman"/>
-          <w:sz w:val="32"/>
-          <w:szCs w:val="32"/>
+          <w:sz w:val="28"/>
+          <w:szCs w:val="28"/>
+        </w:rPr>
+      </w:pPr>
+      <w:r>
+        <w:rPr>
+          <w:rFonts w:ascii="Times New Roman" w:hAnsi="Times New Roman" w:cs="Times New Roman"/>
+          <w:sz w:val="28"/>
+          <w:szCs w:val="28"/>
         </w:rPr>
         <w:t>Componente de Replicação do Índice</w:t>
+      </w:r>
+      <w:r>
+        <w:rPr>
+          <w:rFonts w:ascii="Times New Roman" w:hAnsi="Times New Roman" w:cs="Times New Roman"/>
+          <w:sz w:val="28"/>
+          <w:szCs w:val="28"/>
+        </w:rPr>
+        <w:t>.</w:t>
       </w:r>
     </w:p>
     <w:p>
@@ -911,33 +935,41 @@
         <w:jc w:val="both"/>
         <w:rPr>
           <w:rFonts w:ascii="Times New Roman" w:hAnsi="Times New Roman" w:cs="Times New Roman"/>
-          <w:sz w:val="40"/>
-          <w:szCs w:val="40"/>
-        </w:rPr>
-      </w:pPr>
-      <w:r>
-        <w:rPr>
-          <w:rFonts w:ascii="Times New Roman" w:hAnsi="Times New Roman" w:cs="Times New Roman"/>
-          <w:sz w:val="32"/>
-          <w:szCs w:val="32"/>
+          <w:sz w:val="36"/>
+          <w:szCs w:val="36"/>
+        </w:rPr>
+      </w:pPr>
+      <w:r>
+        <w:rPr>
+          <w:rFonts w:ascii="Times New Roman" w:hAnsi="Times New Roman" w:cs="Times New Roman"/>
+          <w:sz w:val="28"/>
+          <w:szCs w:val="28"/>
         </w:rPr>
         <w:t>Componente</w:t>
       </w:r>
       <w:r>
         <w:rPr>
           <w:rFonts w:ascii="Times New Roman" w:hAnsi="Times New Roman" w:cs="Times New Roman"/>
-          <w:sz w:val="32"/>
-          <w:szCs w:val="32"/>
+          <w:sz w:val="28"/>
+          <w:szCs w:val="28"/>
         </w:rPr>
         <w:t xml:space="preserve"> RMI</w:t>
       </w:r>
       <w:r>
         <w:rPr>
           <w:rFonts w:ascii="Times New Roman" w:hAnsi="Times New Roman" w:cs="Times New Roman"/>
-          <w:sz w:val="32"/>
-          <w:szCs w:val="32"/>
+          <w:sz w:val="28"/>
+          <w:szCs w:val="28"/>
         </w:rPr>
         <w:t xml:space="preserve"> </w:t>
+      </w:r>
+      <w:r>
+        <w:rPr>
+          <w:rFonts w:ascii="Times New Roman" w:hAnsi="Times New Roman" w:cs="Times New Roman"/>
+          <w:sz w:val="28"/>
+          <w:szCs w:val="28"/>
+        </w:rPr>
+        <w:t>.</w:t>
       </w:r>
     </w:p>
     <w:p>
@@ -950,17 +982,25 @@
         <w:jc w:val="both"/>
         <w:rPr>
           <w:rFonts w:ascii="Times New Roman" w:hAnsi="Times New Roman" w:cs="Times New Roman"/>
-          <w:sz w:val="40"/>
-          <w:szCs w:val="40"/>
-        </w:rPr>
-      </w:pPr>
-      <w:r>
-        <w:rPr>
-          <w:rFonts w:ascii="Times New Roman" w:hAnsi="Times New Roman" w:cs="Times New Roman"/>
-          <w:sz w:val="32"/>
-          <w:szCs w:val="32"/>
+          <w:sz w:val="36"/>
+          <w:szCs w:val="36"/>
+        </w:rPr>
+      </w:pPr>
+      <w:r>
+        <w:rPr>
+          <w:rFonts w:ascii="Times New Roman" w:hAnsi="Times New Roman" w:cs="Times New Roman"/>
+          <w:sz w:val="28"/>
+          <w:szCs w:val="28"/>
         </w:rPr>
         <w:t>Testes realizados</w:t>
+      </w:r>
+      <w:r>
+        <w:rPr>
+          <w:rFonts w:ascii="Times New Roman" w:hAnsi="Times New Roman" w:cs="Times New Roman"/>
+          <w:sz w:val="28"/>
+          <w:szCs w:val="28"/>
+        </w:rPr>
+        <w:t>.</w:t>
       </w:r>
     </w:p>
     <w:p>
@@ -973,18 +1013,36 @@
         <w:jc w:val="both"/>
         <w:rPr>
           <w:rFonts w:ascii="Times New Roman" w:hAnsi="Times New Roman" w:cs="Times New Roman"/>
-          <w:sz w:val="40"/>
-          <w:szCs w:val="40"/>
-        </w:rPr>
-      </w:pPr>
-      <w:r>
-        <w:rPr>
-          <w:rFonts w:ascii="Times New Roman" w:hAnsi="Times New Roman" w:cs="Times New Roman"/>
-          <w:sz w:val="32"/>
-          <w:szCs w:val="32"/>
+          <w:sz w:val="36"/>
+          <w:szCs w:val="36"/>
+        </w:rPr>
+      </w:pPr>
+      <w:r>
+        <w:rPr>
+          <w:rFonts w:ascii="Times New Roman" w:hAnsi="Times New Roman" w:cs="Times New Roman"/>
+          <w:sz w:val="28"/>
+          <w:szCs w:val="28"/>
         </w:rPr>
         <w:t>Distribuição de tarefas</w:t>
       </w:r>
+      <w:r>
+        <w:rPr>
+          <w:rFonts w:ascii="Times New Roman" w:hAnsi="Times New Roman" w:cs="Times New Roman"/>
+          <w:sz w:val="28"/>
+          <w:szCs w:val="28"/>
+        </w:rPr>
+        <w:t>.</w:t>
+      </w:r>
+    </w:p>
+    <w:p>
+      <w:pPr>
+        <w:jc w:val="both"/>
+        <w:rPr>
+          <w:rFonts w:ascii="Times New Roman" w:hAnsi="Times New Roman" w:cs="Times New Roman"/>
+          <w:sz w:val="44"/>
+          <w:szCs w:val="44"/>
+        </w:rPr>
+      </w:pPr>
     </w:p>
     <w:p>
       <w:pPr>
@@ -1016,6 +1074,384 @@
           <w:szCs w:val="48"/>
         </w:rPr>
         <w:t>Introdução</w:t>
+      </w:r>
+    </w:p>
+    <w:p>
+      <w:pPr>
+        <w:jc w:val="both"/>
+        <w:rPr>
+          <w:rFonts w:ascii="Times New Roman" w:hAnsi="Times New Roman" w:cs="Times New Roman"/>
+          <w:sz w:val="28"/>
+          <w:szCs w:val="28"/>
+        </w:rPr>
+      </w:pPr>
+      <w:r>
+        <w:rPr>
+          <w:rFonts w:ascii="Times New Roman" w:hAnsi="Times New Roman" w:cs="Times New Roman"/>
+          <w:sz w:val="28"/>
+          <w:szCs w:val="28"/>
+        </w:rPr>
+        <w:t xml:space="preserve">Este projeto implementa um motor de pesquisa web distribuído, capaz de indexar páginas, realizar pesquisas eficientes e garantir tolerância a falhas. O sistema é composto por vários módulos principais: gateway, storage barrels e downloaders, que comunicam entre si usando RPC/RMI e replicação. </w:t>
+      </w:r>
+      <w:r>
+        <w:rPr>
+          <w:rFonts w:ascii="Times New Roman" w:hAnsi="Times New Roman" w:cs="Times New Roman"/>
+          <w:sz w:val="28"/>
+          <w:szCs w:val="28"/>
+        </w:rPr>
+        <w:t>A organização das pastas do projeto é a seguinte:</w:t>
+      </w:r>
+    </w:p>
+    <w:p>
+      <w:pPr>
+        <w:pStyle w:val="ListParagraph"/>
+        <w:numPr>
+          <w:ilvl w:val="0"/>
+          <w:numId w:val="4"/>
+        </w:numPr>
+        <w:jc w:val="both"/>
+        <w:rPr>
+          <w:rFonts w:ascii="Times New Roman" w:hAnsi="Times New Roman" w:cs="Times New Roman"/>
+          <w:sz w:val="28"/>
+          <w:szCs w:val="28"/>
+        </w:rPr>
+      </w:pPr>
+      <w:r>
+        <w:rPr>
+          <w:rFonts w:ascii="Times New Roman" w:hAnsi="Times New Roman" w:cs="Times New Roman"/>
+          <w:b/>
+          <w:bCs/>
+          <w:sz w:val="28"/>
+          <w:szCs w:val="28"/>
+        </w:rPr>
+        <w:t xml:space="preserve">/config: </w:t>
+      </w:r>
+      <w:r>
+        <w:rPr>
+          <w:rFonts w:ascii="Times New Roman" w:hAnsi="Times New Roman" w:cs="Times New Roman"/>
+          <w:sz w:val="28"/>
+          <w:szCs w:val="28"/>
+        </w:rPr>
+        <w:t>Ficheiros de c</w:t>
+      </w:r>
+      <w:r>
+        <w:rPr>
+          <w:rFonts w:ascii="Times New Roman" w:hAnsi="Times New Roman" w:cs="Times New Roman"/>
+          <w:sz w:val="28"/>
+          <w:szCs w:val="28"/>
+        </w:rPr>
+        <w:t>onfiguração para parametrizazão de componentes sem rec</w:t>
+      </w:r>
+      <w:r>
+        <w:rPr>
+          <w:rFonts w:ascii="Times New Roman" w:hAnsi="Times New Roman" w:cs="Times New Roman"/>
+          <w:sz w:val="28"/>
+          <w:szCs w:val="28"/>
+        </w:rPr>
+        <w:t>ompilação</w:t>
+      </w:r>
+      <w:r>
+        <w:rPr>
+          <w:rFonts w:ascii="Times New Roman" w:hAnsi="Times New Roman" w:cs="Times New Roman"/>
+          <w:sz w:val="28"/>
+          <w:szCs w:val="28"/>
+        </w:rPr>
+        <w:t>.</w:t>
+      </w:r>
+    </w:p>
+    <w:p>
+      <w:pPr>
+        <w:pStyle w:val="ListParagraph"/>
+        <w:numPr>
+          <w:ilvl w:val="0"/>
+          <w:numId w:val="4"/>
+        </w:numPr>
+        <w:jc w:val="both"/>
+        <w:rPr>
+          <w:rFonts w:ascii="Times New Roman" w:hAnsi="Times New Roman" w:cs="Times New Roman"/>
+          <w:sz w:val="28"/>
+          <w:szCs w:val="28"/>
+        </w:rPr>
+      </w:pPr>
+      <w:r>
+        <w:rPr>
+          <w:rFonts w:ascii="Times New Roman" w:hAnsi="Times New Roman" w:cs="Times New Roman"/>
+          <w:b/>
+          <w:bCs/>
+          <w:sz w:val="28"/>
+          <w:szCs w:val="28"/>
+        </w:rPr>
+        <w:t>/data:</w:t>
+      </w:r>
+      <w:r>
+        <w:rPr>
+          <w:rFonts w:ascii="Times New Roman" w:hAnsi="Times New Roman" w:cs="Times New Roman"/>
+          <w:sz w:val="28"/>
+          <w:szCs w:val="28"/>
+        </w:rPr>
+        <w:t xml:space="preserve"> </w:t>
+      </w:r>
+      <w:r>
+        <w:rPr>
+          <w:rFonts w:ascii="Times New Roman" w:hAnsi="Times New Roman" w:cs="Times New Roman"/>
+          <w:sz w:val="28"/>
+          <w:szCs w:val="28"/>
+        </w:rPr>
+        <w:t>Dados persistentes</w:t>
+      </w:r>
+      <w:r>
+        <w:rPr>
+          <w:rFonts w:ascii="Times New Roman" w:hAnsi="Times New Roman" w:cs="Times New Roman"/>
+          <w:sz w:val="28"/>
+          <w:szCs w:val="28"/>
+        </w:rPr>
+        <w:t xml:space="preserve"> (estatísticas e fila de urls)</w:t>
+      </w:r>
+      <w:r>
+        <w:rPr>
+          <w:rFonts w:ascii="Times New Roman" w:hAnsi="Times New Roman" w:cs="Times New Roman"/>
+          <w:sz w:val="28"/>
+          <w:szCs w:val="28"/>
+        </w:rPr>
+        <w:t xml:space="preserve"> utilizados pelo sistema.</w:t>
+      </w:r>
+    </w:p>
+    <w:p>
+      <w:pPr>
+        <w:pStyle w:val="ListParagraph"/>
+        <w:numPr>
+          <w:ilvl w:val="0"/>
+          <w:numId w:val="4"/>
+        </w:numPr>
+        <w:jc w:val="both"/>
+        <w:rPr>
+          <w:rFonts w:ascii="Times New Roman" w:hAnsi="Times New Roman" w:cs="Times New Roman"/>
+          <w:sz w:val="28"/>
+          <w:szCs w:val="28"/>
+        </w:rPr>
+      </w:pPr>
+      <w:r>
+        <w:rPr>
+          <w:rFonts w:ascii="Times New Roman" w:hAnsi="Times New Roman" w:cs="Times New Roman"/>
+          <w:b/>
+          <w:bCs/>
+          <w:sz w:val="28"/>
+          <w:szCs w:val="28"/>
+        </w:rPr>
+        <w:t xml:space="preserve">/docs: </w:t>
+      </w:r>
+      <w:r>
+        <w:rPr>
+          <w:rFonts w:ascii="Times New Roman" w:hAnsi="Times New Roman" w:cs="Times New Roman"/>
+          <w:sz w:val="28"/>
+          <w:szCs w:val="28"/>
+        </w:rPr>
+        <w:t>Documentação técnica e relatório detalhado do projeto.</w:t>
+      </w:r>
+    </w:p>
+    <w:p>
+      <w:pPr>
+        <w:pStyle w:val="ListParagraph"/>
+        <w:numPr>
+          <w:ilvl w:val="0"/>
+          <w:numId w:val="4"/>
+        </w:numPr>
+        <w:jc w:val="both"/>
+        <w:rPr>
+          <w:rFonts w:ascii="Times New Roman" w:hAnsi="Times New Roman" w:cs="Times New Roman"/>
+          <w:sz w:val="28"/>
+          <w:szCs w:val="28"/>
+        </w:rPr>
+      </w:pPr>
+      <w:r>
+        <w:rPr>
+          <w:rFonts w:ascii="Times New Roman" w:hAnsi="Times New Roman" w:cs="Times New Roman"/>
+          <w:b/>
+          <w:bCs/>
+          <w:sz w:val="28"/>
+          <w:szCs w:val="28"/>
+        </w:rPr>
+        <w:t>/</w:t>
+      </w:r>
+      <w:r>
+        <w:rPr>
+          <w:rFonts w:ascii="Times New Roman" w:hAnsi="Times New Roman" w:cs="Times New Roman"/>
+          <w:b/>
+          <w:bCs/>
+          <w:sz w:val="28"/>
+          <w:szCs w:val="28"/>
+        </w:rPr>
+        <w:t>misc:</w:t>
+      </w:r>
+      <w:r>
+        <w:rPr>
+          <w:rFonts w:ascii="Times New Roman" w:hAnsi="Times New Roman" w:cs="Times New Roman"/>
+          <w:sz w:val="28"/>
+          <w:szCs w:val="28"/>
+        </w:rPr>
+        <w:t xml:space="preserve"> </w:t>
+      </w:r>
+      <w:r>
+        <w:rPr>
+          <w:rFonts w:ascii="Times New Roman" w:hAnsi="Times New Roman" w:cs="Times New Roman"/>
+          <w:sz w:val="28"/>
+          <w:szCs w:val="28"/>
+        </w:rPr>
+        <w:t>Ficheiros auxiliares e documentação adicional.</w:t>
+      </w:r>
+    </w:p>
+    <w:p>
+      <w:pPr>
+        <w:pStyle w:val="ListParagraph"/>
+        <w:numPr>
+          <w:ilvl w:val="0"/>
+          <w:numId w:val="4"/>
+        </w:numPr>
+        <w:jc w:val="both"/>
+        <w:rPr>
+          <w:rFonts w:ascii="Times New Roman" w:hAnsi="Times New Roman" w:cs="Times New Roman"/>
+          <w:sz w:val="28"/>
+          <w:szCs w:val="28"/>
+        </w:rPr>
+      </w:pPr>
+      <w:r>
+        <w:rPr>
+          <w:rFonts w:ascii="Times New Roman" w:hAnsi="Times New Roman" w:cs="Times New Roman"/>
+          <w:b/>
+          <w:bCs/>
+          <w:sz w:val="28"/>
+          <w:szCs w:val="28"/>
+        </w:rPr>
+        <w:t xml:space="preserve">/scripts: </w:t>
+      </w:r>
+      <w:r>
+        <w:rPr>
+          <w:rFonts w:ascii="Times New Roman" w:hAnsi="Times New Roman" w:cs="Times New Roman"/>
+          <w:sz w:val="28"/>
+          <w:szCs w:val="28"/>
+        </w:rPr>
+        <w:t>Scripts relacionados às bases de dados utilizadas.</w:t>
+      </w:r>
+    </w:p>
+    <w:p>
+      <w:pPr>
+        <w:pStyle w:val="ListParagraph"/>
+        <w:numPr>
+          <w:ilvl w:val="0"/>
+          <w:numId w:val="4"/>
+        </w:numPr>
+        <w:jc w:val="both"/>
+        <w:rPr>
+          <w:rFonts w:ascii="Times New Roman" w:hAnsi="Times New Roman" w:cs="Times New Roman"/>
+          <w:sz w:val="28"/>
+          <w:szCs w:val="28"/>
+        </w:rPr>
+      </w:pPr>
+      <w:r>
+        <w:rPr>
+          <w:rFonts w:ascii="Times New Roman" w:hAnsi="Times New Roman" w:cs="Times New Roman"/>
+          <w:b/>
+          <w:bCs/>
+          <w:sz w:val="28"/>
+          <w:szCs w:val="28"/>
+        </w:rPr>
+        <w:t xml:space="preserve">/src: </w:t>
+      </w:r>
+      <w:r>
+        <w:rPr>
+          <w:rFonts w:ascii="Times New Roman" w:hAnsi="Times New Roman" w:cs="Times New Roman"/>
+          <w:sz w:val="28"/>
+          <w:szCs w:val="28"/>
+        </w:rPr>
+        <w:t>Código fonte.</w:t>
+      </w:r>
+    </w:p>
+    <w:p>
+      <w:pPr>
+        <w:pStyle w:val="ListParagraph"/>
+        <w:numPr>
+          <w:ilvl w:val="0"/>
+          <w:numId w:val="4"/>
+        </w:numPr>
+        <w:jc w:val="both"/>
+        <w:rPr>
+          <w:rFonts w:ascii="Times New Roman" w:hAnsi="Times New Roman" w:cs="Times New Roman"/>
+          <w:sz w:val="28"/>
+          <w:szCs w:val="28"/>
+        </w:rPr>
+      </w:pPr>
+      <w:r>
+        <w:rPr>
+          <w:rFonts w:ascii="Times New Roman" w:hAnsi="Times New Roman" w:cs="Times New Roman"/>
+          <w:b/>
+          <w:bCs/>
+          <w:sz w:val="28"/>
+          <w:szCs w:val="28"/>
+        </w:rPr>
+        <w:t xml:space="preserve">/target: </w:t>
+      </w:r>
+      <w:r>
+        <w:rPr>
+          <w:rFonts w:ascii="Times New Roman" w:hAnsi="Times New Roman" w:cs="Times New Roman"/>
+          <w:sz w:val="28"/>
+          <w:szCs w:val="28"/>
+        </w:rPr>
+        <w:t>Ficheiros compilados, binários e artefactos gerados</w:t>
+      </w:r>
+      <w:r>
+        <w:rPr>
+          <w:rFonts w:ascii="Times New Roman" w:hAnsi="Times New Roman" w:cs="Times New Roman"/>
+          <w:sz w:val="28"/>
+          <w:szCs w:val="28"/>
+        </w:rPr>
+        <w:t>.</w:t>
+      </w:r>
+    </w:p>
+    <w:p>
+      <w:pPr>
+        <w:jc w:val="both"/>
+        <w:rPr>
+          <w:rFonts w:ascii="Times New Roman" w:hAnsi="Times New Roman" w:cs="Times New Roman"/>
+          <w:b/>
+          <w:bCs/>
+          <w:sz w:val="48"/>
+          <w:szCs w:val="48"/>
+        </w:rPr>
+      </w:pPr>
+    </w:p>
+    <w:p>
+      <w:pPr>
+        <w:jc w:val="both"/>
+        <w:rPr>
+          <w:rFonts w:ascii="Times New Roman" w:hAnsi="Times New Roman" w:cs="Times New Roman"/>
+          <w:b/>
+          <w:bCs/>
+          <w:sz w:val="48"/>
+          <w:szCs w:val="48"/>
+        </w:rPr>
+      </w:pPr>
+    </w:p>
+    <w:p>
+      <w:pPr>
+        <w:jc w:val="both"/>
+        <w:rPr>
+          <w:rFonts w:ascii="Times New Roman" w:hAnsi="Times New Roman" w:cs="Times New Roman"/>
+          <w:b/>
+          <w:bCs/>
+          <w:sz w:val="48"/>
+          <w:szCs w:val="48"/>
+        </w:rPr>
+      </w:pPr>
+      <w:r>
+        <w:rPr>
+          <w:rFonts w:ascii="Times New Roman" w:hAnsi="Times New Roman" w:cs="Times New Roman"/>
+          <w:b/>
+          <w:bCs/>
+          <w:sz w:val="48"/>
+          <w:szCs w:val="48"/>
+        </w:rPr>
+        <w:lastRenderedPageBreak/>
+        <w:t>Arquitetura Geral do Projeto</w:t>
       </w:r>
     </w:p>
     <w:sectPr>
@@ -1401,6 +1837,119 @@
       </w:pPr>
     </w:lvl>
   </w:abstractNum>
+  <w:abstractNum w:abstractNumId="3" w15:restartNumberingAfterBreak="0">
+    <w:nsid w:val="64CA6CB6"/>
+    <w:multiLevelType w:val="hybridMultilevel"/>
+    <w:tmpl w:val="90F4769E"/>
+    <w:lvl w:ilvl="0" w:tplc="08160001">
+      <w:start w:val="1"/>
+      <w:numFmt w:val="bullet"/>
+      <w:lvlText w:val=""/>
+      <w:lvlJc w:val="left"/>
+      <w:pPr>
+        <w:ind w:left="720" w:hanging="360"/>
+      </w:pPr>
+      <w:rPr>
+        <w:rFonts w:ascii="Symbol" w:hAnsi="Symbol" w:hint="default"/>
+      </w:rPr>
+    </w:lvl>
+    <w:lvl w:ilvl="1" w:tplc="08160003" w:tentative="1">
+      <w:start w:val="1"/>
+      <w:numFmt w:val="bullet"/>
+      <w:lvlText w:val="o"/>
+      <w:lvlJc w:val="left"/>
+      <w:pPr>
+        <w:ind w:left="1440" w:hanging="360"/>
+      </w:pPr>
+      <w:rPr>
+        <w:rFonts w:ascii="Courier New" w:hAnsi="Courier New" w:cs="Courier New" w:hint="default"/>
+      </w:rPr>
+    </w:lvl>
+    <w:lvl w:ilvl="2" w:tplc="08160005" w:tentative="1">
+      <w:start w:val="1"/>
+      <w:numFmt w:val="bullet"/>
+      <w:lvlText w:val=""/>
+      <w:lvlJc w:val="left"/>
+      <w:pPr>
+        <w:ind w:left="2160" w:hanging="360"/>
+      </w:pPr>
+      <w:rPr>
+        <w:rFonts w:ascii="Wingdings" w:hAnsi="Wingdings" w:hint="default"/>
+      </w:rPr>
+    </w:lvl>
+    <w:lvl w:ilvl="3" w:tplc="08160001" w:tentative="1">
+      <w:start w:val="1"/>
+      <w:numFmt w:val="bullet"/>
+      <w:lvlText w:val=""/>
+      <w:lvlJc w:val="left"/>
+      <w:pPr>
+        <w:ind w:left="2880" w:hanging="360"/>
+      </w:pPr>
+      <w:rPr>
+        <w:rFonts w:ascii="Symbol" w:hAnsi="Symbol" w:hint="default"/>
+      </w:rPr>
+    </w:lvl>
+    <w:lvl w:ilvl="4" w:tplc="08160003" w:tentative="1">
+      <w:start w:val="1"/>
+      <w:numFmt w:val="bullet"/>
+      <w:lvlText w:val="o"/>
+      <w:lvlJc w:val="left"/>
+      <w:pPr>
+        <w:ind w:left="3600" w:hanging="360"/>
+      </w:pPr>
+      <w:rPr>
+        <w:rFonts w:ascii="Courier New" w:hAnsi="Courier New" w:cs="Courier New" w:hint="default"/>
+      </w:rPr>
+    </w:lvl>
+    <w:lvl w:ilvl="5" w:tplc="08160005" w:tentative="1">
+      <w:start w:val="1"/>
+      <w:numFmt w:val="bullet"/>
+      <w:lvlText w:val=""/>
+      <w:lvlJc w:val="left"/>
+      <w:pPr>
+        <w:ind w:left="4320" w:hanging="360"/>
+      </w:pPr>
+      <w:rPr>
+        <w:rFonts w:ascii="Wingdings" w:hAnsi="Wingdings" w:hint="default"/>
+      </w:rPr>
+    </w:lvl>
+    <w:lvl w:ilvl="6" w:tplc="08160001" w:tentative="1">
+      <w:start w:val="1"/>
+      <w:numFmt w:val="bullet"/>
+      <w:lvlText w:val=""/>
+      <w:lvlJc w:val="left"/>
+      <w:pPr>
+        <w:ind w:left="5040" w:hanging="360"/>
+      </w:pPr>
+      <w:rPr>
+        <w:rFonts w:ascii="Symbol" w:hAnsi="Symbol" w:hint="default"/>
+      </w:rPr>
+    </w:lvl>
+    <w:lvl w:ilvl="7" w:tplc="08160003" w:tentative="1">
+      <w:start w:val="1"/>
+      <w:numFmt w:val="bullet"/>
+      <w:lvlText w:val="o"/>
+      <w:lvlJc w:val="left"/>
+      <w:pPr>
+        <w:ind w:left="5760" w:hanging="360"/>
+      </w:pPr>
+      <w:rPr>
+        <w:rFonts w:ascii="Courier New" w:hAnsi="Courier New" w:cs="Courier New" w:hint="default"/>
+      </w:rPr>
+    </w:lvl>
+    <w:lvl w:ilvl="8" w:tplc="08160005" w:tentative="1">
+      <w:start w:val="1"/>
+      <w:numFmt w:val="bullet"/>
+      <w:lvlText w:val=""/>
+      <w:lvlJc w:val="left"/>
+      <w:pPr>
+        <w:ind w:left="6480" w:hanging="360"/>
+      </w:pPr>
+      <w:rPr>
+        <w:rFonts w:ascii="Wingdings" w:hAnsi="Wingdings" w:hint="default"/>
+      </w:rPr>
+    </w:lvl>
+  </w:abstractNum>
   <w:num w:numId="1" w16cid:durableId="1877278731">
     <w:abstractNumId w:val="2"/>
   </w:num>
@@ -1409,6 +1958,9 @@
   </w:num>
   <w:num w:numId="3" w16cid:durableId="516699777">
     <w:abstractNumId w:val="0"/>
+  </w:num>
+  <w:num w:numId="4" w16cid:durableId="191462187">
+    <w:abstractNumId w:val="3"/>
   </w:num>
 </w:numbering>
 </file>
@@ -2016,7 +2568,6 @@
   <w:style w:type="character" w:default="1" w:styleId="DefaultParagraphFont">
     <w:name w:val="Default Paragraph Font"/>
     <w:uiPriority w:val="1"/>
-    <w:semiHidden/>
     <w:unhideWhenUsed/>
   </w:style>
   <w:style w:type="table" w:default="1" w:styleId="TableNormal">

</xml_diff>